<commit_message>
Convert Kruti Dev templates to Unicode; reorganize template folders
</commit_message>
<xml_diff>
--- a/public/Templates/affidavit/marathi/Marig affidevit 1.docx
+++ b/public/Templates/affidavit/marathi/Marig affidevit 1.docx
@@ -6,7 +6,7 @@
       <w:pPr>
         <w:jc w:val="center"/>
         <w:rPr>
-          <w:rFonts w:cs="Mangal"/>
+          <w:rFonts w:asciiTheme="minorBidi" w:hAnsiTheme="minorBidi"/>
           <w:sz w:val="32"/>
           <w:szCs w:val="32"/>
           <w:lang w:bidi="hi-IN"/>
@@ -17,7 +17,7 @@
       <w:pPr>
         <w:jc w:val="center"/>
         <w:rPr>
-          <w:rFonts w:cs="Mangal"/>
+          <w:rFonts w:asciiTheme="minorBidi" w:hAnsiTheme="minorBidi"/>
           <w:sz w:val="32"/>
           <w:szCs w:val="32"/>
           <w:lang w:bidi="hi-IN"/>
@@ -28,7 +28,7 @@
       <w:pPr>
         <w:jc w:val="center"/>
         <w:rPr>
-          <w:rFonts w:cs="Mangal"/>
+          <w:rFonts w:asciiTheme="minorBidi" w:hAnsiTheme="minorBidi"/>
           <w:sz w:val="32"/>
           <w:szCs w:val="32"/>
           <w:lang w:bidi="hi-IN"/>
@@ -39,7 +39,7 @@
       <w:pPr>
         <w:jc w:val="center"/>
         <w:rPr>
-          <w:rFonts w:cs="Mangal"/>
+          <w:rFonts w:asciiTheme="minorBidi" w:hAnsiTheme="minorBidi"/>
           <w:sz w:val="32"/>
           <w:szCs w:val="32"/>
           <w:lang w:bidi="hi-IN"/>
@@ -50,7 +50,7 @@
       <w:pPr>
         <w:jc w:val="center"/>
         <w:rPr>
-          <w:rFonts w:cs="Mangal"/>
+          <w:rFonts w:asciiTheme="minorBidi" w:hAnsiTheme="minorBidi"/>
           <w:sz w:val="32"/>
           <w:szCs w:val="32"/>
           <w:lang w:bidi="hi-IN"/>
@@ -61,7 +61,7 @@
       <w:pPr>
         <w:jc w:val="center"/>
         <w:rPr>
-          <w:rFonts w:cs="Mangal"/>
+          <w:rFonts w:asciiTheme="minorBidi" w:hAnsiTheme="minorBidi"/>
           <w:sz w:val="32"/>
           <w:szCs w:val="32"/>
           <w:lang w:bidi="hi-IN"/>
@@ -72,7 +72,7 @@
       <w:pPr>
         <w:jc w:val="center"/>
         <w:rPr>
-          <w:rFonts w:cs="Mangal"/>
+          <w:rFonts w:asciiTheme="minorBidi" w:hAnsiTheme="minorBidi"/>
           <w:sz w:val="32"/>
           <w:szCs w:val="32"/>
           <w:lang w:bidi="hi-IN"/>
@@ -83,7 +83,7 @@
       <w:pPr>
         <w:jc w:val="center"/>
         <w:rPr>
-          <w:rFonts w:cs="Mangal"/>
+          <w:rFonts w:asciiTheme="minorBidi" w:hAnsiTheme="minorBidi"/>
           <w:sz w:val="32"/>
           <w:szCs w:val="32"/>
           <w:lang w:bidi="hi-IN"/>
@@ -94,7 +94,7 @@
       <w:pPr>
         <w:jc w:val="center"/>
         <w:rPr>
-          <w:rFonts w:cs="Mangal"/>
+          <w:rFonts w:asciiTheme="minorBidi" w:hAnsiTheme="minorBidi"/>
           <w:sz w:val="32"/>
           <w:szCs w:val="32"/>
           <w:lang w:bidi="hi-IN"/>
@@ -105,7 +105,7 @@
       <w:pPr>
         <w:jc w:val="center"/>
         <w:rPr>
-          <w:rFonts w:cs="Mangal"/>
+          <w:rFonts w:asciiTheme="minorBidi" w:hAnsiTheme="minorBidi"/>
           <w:b/>
           <w:bCs/>
           <w:sz w:val="32"/>
@@ -118,6 +118,7 @@
       <w:pPr>
         <w:jc w:val="center"/>
         <w:rPr>
+          <w:rFonts w:asciiTheme="minorBidi" w:hAnsiTheme="minorBidi"/>
           <w:b/>
           <w:bCs/>
           <w:sz w:val="32"/>
@@ -126,7 +127,7 @@
       </w:pPr>
       <w:r>
         <w:rPr>
-          <w:rFonts w:cs="Mangal"/>
+          <w:rFonts w:asciiTheme="minorBidi" w:hAnsiTheme="minorBidi"/>
           <w:b/>
           <w:bCs/>
           <w:sz w:val="32"/>
@@ -138,7 +139,7 @@
       </w:r>
       <w:r>
         <w:rPr>
-          <w:rFonts w:cs="Mangal"/>
+          <w:rFonts w:asciiTheme="minorBidi" w:hAnsiTheme="minorBidi"/>
           <w:b/>
           <w:bCs/>
           <w:sz w:val="32"/>
@@ -149,7 +150,7 @@
       </w:r>
       <w:r>
         <w:rPr>
-          <w:rFonts w:cs="Mangal"/>
+          <w:rFonts w:asciiTheme="minorBidi" w:hAnsiTheme="minorBidi"/>
           <w:b/>
           <w:bCs/>
           <w:sz w:val="32"/>
@@ -161,7 +162,7 @@
       </w:r>
       <w:r>
         <w:rPr>
-          <w:rFonts w:cs="Mangal"/>
+          <w:rFonts w:asciiTheme="minorBidi" w:hAnsiTheme="minorBidi"/>
           <w:b/>
           <w:bCs/>
           <w:sz w:val="32"/>
@@ -171,7 +172,7 @@
       </w:r>
       <w:r>
         <w:rPr>
-          <w:rFonts w:cs="Mangal"/>
+          <w:rFonts w:asciiTheme="minorBidi" w:hAnsiTheme="minorBidi"/>
           <w:b/>
           <w:bCs/>
           <w:sz w:val="32"/>
@@ -187,15 +188,15 @@
         <w:spacing w:after="0"/>
         <w:ind w:firstLine="720"/>
         <w:rPr>
-          <w:rFonts w:cs="Mangal"/>
-          <w:sz w:val="26"/>
-          <w:szCs w:val="26"/>
-          <w:lang w:bidi="hi-IN"/>
-        </w:rPr>
-      </w:pPr>
-      <w:r>
-        <w:rPr>
-          <w:rFonts w:cs="Mangal"/>
+          <w:rFonts w:asciiTheme="minorBidi" w:hAnsiTheme="minorBidi"/>
+          <w:sz w:val="26"/>
+          <w:szCs w:val="26"/>
+          <w:lang w:bidi="hi-IN"/>
+        </w:rPr>
+      </w:pPr>
+      <w:r>
+        <w:rPr>
+          <w:rFonts w:asciiTheme="minorBidi" w:hAnsiTheme="minorBidi"/>
           <w:sz w:val="26"/>
           <w:szCs w:val="26"/>
           <w:cs/>
@@ -205,6 +206,7 @@
       </w:r>
       <w:r>
         <w:rPr>
+          <w:rFonts w:asciiTheme="minorBidi" w:hAnsiTheme="minorBidi"/>
           <w:sz w:val="26"/>
           <w:szCs w:val="26"/>
         </w:rPr>
@@ -212,7 +214,7 @@
       </w:r>
       <w:r>
         <w:rPr>
-          <w:rFonts w:cs="Mangal"/>
+          <w:rFonts w:asciiTheme="minorBidi" w:hAnsiTheme="minorBidi"/>
           <w:sz w:val="26"/>
           <w:szCs w:val="26"/>
           <w:cs/>
@@ -226,13 +228,14 @@
         <w:spacing w:after="0"/>
         <w:ind w:left="2160" w:firstLine="720"/>
         <w:rPr>
-          <w:sz w:val="26"/>
-          <w:szCs w:val="26"/>
-        </w:rPr>
-      </w:pPr>
-      <w:r>
-        <w:rPr>
-          <w:rFonts w:cs="Mangal"/>
+          <w:rFonts w:asciiTheme="minorBidi" w:hAnsiTheme="minorBidi"/>
+          <w:sz w:val="26"/>
+          <w:szCs w:val="26"/>
+        </w:rPr>
+      </w:pPr>
+      <w:r>
+        <w:rPr>
+          <w:rFonts w:asciiTheme="minorBidi" w:hAnsiTheme="minorBidi"/>
           <w:sz w:val="26"/>
           <w:szCs w:val="26"/>
           <w:cs/>
@@ -242,7 +245,7 @@
       </w:r>
       <w:r>
         <w:rPr>
-          <w:rFonts w:cs="Mangal"/>
+          <w:rFonts w:asciiTheme="minorBidi" w:hAnsiTheme="minorBidi"/>
           <w:sz w:val="26"/>
           <w:szCs w:val="26"/>
           <w:lang w:bidi="hi-IN"/>
@@ -251,7 +254,7 @@
       </w:r>
       <w:r>
         <w:rPr>
-          <w:rFonts w:cs="Mangal"/>
+          <w:rFonts w:asciiTheme="minorBidi" w:hAnsiTheme="minorBidi"/>
           <w:sz w:val="26"/>
           <w:szCs w:val="26"/>
           <w:cs/>
@@ -261,6 +264,7 @@
       </w:r>
       <w:r>
         <w:rPr>
+          <w:rFonts w:asciiTheme="minorBidi" w:hAnsiTheme="minorBidi"/>
           <w:sz w:val="26"/>
           <w:szCs w:val="26"/>
         </w:rPr>
@@ -268,7 +272,7 @@
       </w:r>
       <w:r>
         <w:rPr>
-          <w:rFonts w:cs="Mangal"/>
+          <w:rFonts w:asciiTheme="minorBidi" w:hAnsiTheme="minorBidi"/>
           <w:sz w:val="26"/>
           <w:szCs w:val="26"/>
           <w:cs/>
@@ -282,15 +286,15 @@
         <w:spacing w:after="0"/>
         <w:ind w:left="2880"/>
         <w:rPr>
-          <w:rFonts w:cs="Mangal"/>
-          <w:sz w:val="26"/>
-          <w:szCs w:val="26"/>
-          <w:lang w:bidi="hi-IN"/>
-        </w:rPr>
-      </w:pPr>
-      <w:r>
-        <w:rPr>
-          <w:rFonts w:cs="Mangal"/>
+          <w:rFonts w:asciiTheme="minorBidi" w:hAnsiTheme="minorBidi"/>
+          <w:sz w:val="26"/>
+          <w:szCs w:val="26"/>
+          <w:lang w:bidi="hi-IN"/>
+        </w:rPr>
+      </w:pPr>
+      <w:r>
+        <w:rPr>
+          <w:rFonts w:asciiTheme="minorBidi" w:hAnsiTheme="minorBidi"/>
           <w:sz w:val="26"/>
           <w:szCs w:val="26"/>
           <w:cs/>
@@ -300,6 +304,7 @@
       </w:r>
       <w:r>
         <w:rPr>
+          <w:rFonts w:asciiTheme="minorBidi" w:hAnsiTheme="minorBidi"/>
           <w:sz w:val="26"/>
           <w:szCs w:val="26"/>
         </w:rPr>
@@ -307,7 +312,7 @@
       </w:r>
       <w:r>
         <w:rPr>
-          <w:rFonts w:cs="Mangal"/>
+          <w:rFonts w:asciiTheme="minorBidi" w:hAnsiTheme="minorBidi"/>
           <w:sz w:val="26"/>
           <w:szCs w:val="26"/>
           <w:cs/>
@@ -317,6 +322,7 @@
       </w:r>
       <w:r>
         <w:rPr>
+          <w:rFonts w:asciiTheme="minorBidi" w:hAnsiTheme="minorBidi"/>
           <w:sz w:val="26"/>
           <w:szCs w:val="26"/>
         </w:rPr>
@@ -324,7 +330,7 @@
       </w:r>
       <w:r>
         <w:rPr>
-          <w:rFonts w:cs="Mangal"/>
+          <w:rFonts w:asciiTheme="minorBidi" w:hAnsiTheme="minorBidi"/>
           <w:sz w:val="26"/>
           <w:szCs w:val="26"/>
           <w:cs/>
@@ -338,13 +344,14 @@
         <w:spacing w:after="0"/>
         <w:ind w:left="2880"/>
         <w:rPr>
-          <w:sz w:val="26"/>
-          <w:szCs w:val="26"/>
-        </w:rPr>
-      </w:pPr>
-      <w:r>
-        <w:rPr>
-          <w:rFonts w:cs="Mangal"/>
+          <w:rFonts w:asciiTheme="minorBidi" w:hAnsiTheme="minorBidi"/>
+          <w:sz w:val="26"/>
+          <w:szCs w:val="26"/>
+        </w:rPr>
+      </w:pPr>
+      <w:r>
+        <w:rPr>
+          <w:rFonts w:asciiTheme="minorBidi" w:hAnsiTheme="minorBidi"/>
           <w:sz w:val="26"/>
           <w:szCs w:val="26"/>
           <w:cs/>
@@ -354,6 +361,7 @@
       </w:r>
       <w:r>
         <w:rPr>
+          <w:rFonts w:asciiTheme="minorBidi" w:hAnsiTheme="minorBidi"/>
           <w:sz w:val="26"/>
           <w:szCs w:val="26"/>
         </w:rPr>
@@ -361,7 +369,7 @@
       </w:r>
       <w:r>
         <w:rPr>
-          <w:rFonts w:cs="Mangal"/>
+          <w:rFonts w:asciiTheme="minorBidi" w:hAnsiTheme="minorBidi"/>
           <w:sz w:val="26"/>
           <w:szCs w:val="26"/>
           <w:cs/>
@@ -371,6 +379,7 @@
       </w:r>
       <w:r>
         <w:rPr>
+          <w:rFonts w:asciiTheme="minorBidi" w:hAnsiTheme="minorBidi"/>
           <w:sz w:val="26"/>
           <w:szCs w:val="26"/>
         </w:rPr>
@@ -378,7 +387,7 @@
       </w:r>
       <w:r>
         <w:rPr>
-          <w:rFonts w:cs="Mangal"/>
+          <w:rFonts w:asciiTheme="minorBidi" w:hAnsiTheme="minorBidi"/>
           <w:sz w:val="26"/>
           <w:szCs w:val="26"/>
           <w:cs/>
@@ -388,6 +397,7 @@
       </w:r>
       <w:r>
         <w:rPr>
+          <w:rFonts w:asciiTheme="minorBidi" w:hAnsiTheme="minorBidi"/>
           <w:sz w:val="26"/>
           <w:szCs w:val="26"/>
         </w:rPr>
@@ -395,7 +405,7 @@
       </w:r>
       <w:r>
         <w:rPr>
-          <w:rFonts w:cs="Mangal"/>
+          <w:rFonts w:asciiTheme="minorBidi" w:hAnsiTheme="minorBidi"/>
           <w:sz w:val="26"/>
           <w:szCs w:val="26"/>
           <w:cs/>
@@ -405,6 +415,7 @@
       </w:r>
       <w:r>
         <w:rPr>
+          <w:rFonts w:asciiTheme="minorBidi" w:hAnsiTheme="minorBidi"/>
           <w:sz w:val="26"/>
           <w:szCs w:val="26"/>
         </w:rPr>
@@ -416,13 +427,14 @@
         <w:spacing w:after="0"/>
         <w:ind w:left="2880"/>
         <w:rPr>
-          <w:sz w:val="26"/>
-          <w:szCs w:val="26"/>
-        </w:rPr>
-      </w:pPr>
-      <w:r>
-        <w:rPr>
-          <w:rFonts w:cs="Mangal"/>
+          <w:rFonts w:asciiTheme="minorBidi" w:hAnsiTheme="minorBidi"/>
+          <w:sz w:val="26"/>
+          <w:szCs w:val="26"/>
+        </w:rPr>
+      </w:pPr>
+      <w:r>
+        <w:rPr>
+          <w:rFonts w:asciiTheme="minorBidi" w:hAnsiTheme="minorBidi"/>
           <w:sz w:val="26"/>
           <w:szCs w:val="26"/>
           <w:cs/>
@@ -432,6 +444,7 @@
       </w:r>
       <w:r>
         <w:rPr>
+          <w:rFonts w:asciiTheme="minorBidi" w:hAnsiTheme="minorBidi"/>
           <w:sz w:val="26"/>
           <w:szCs w:val="26"/>
         </w:rPr>
@@ -439,7 +452,7 @@
       </w:r>
       <w:r>
         <w:rPr>
-          <w:rFonts w:cs="Mangal"/>
+          <w:rFonts w:asciiTheme="minorBidi" w:hAnsiTheme="minorBidi"/>
           <w:sz w:val="26"/>
           <w:szCs w:val="26"/>
           <w:cs/>
@@ -453,15 +466,15 @@
         <w:spacing w:after="0"/>
         <w:ind w:firstLine="720"/>
         <w:rPr>
-          <w:rFonts w:cs="Mangal"/>
-          <w:sz w:val="26"/>
-          <w:szCs w:val="26"/>
-          <w:lang w:bidi="hi-IN"/>
-        </w:rPr>
-      </w:pPr>
-      <w:r>
-        <w:rPr>
-          <w:rFonts w:cs="Mangal"/>
+          <w:rFonts w:asciiTheme="minorBidi" w:hAnsiTheme="minorBidi"/>
+          <w:sz w:val="26"/>
+          <w:szCs w:val="26"/>
+          <w:lang w:bidi="hi-IN"/>
+        </w:rPr>
+      </w:pPr>
+      <w:r>
+        <w:rPr>
+          <w:rFonts w:asciiTheme="minorBidi" w:hAnsiTheme="minorBidi"/>
           <w:sz w:val="26"/>
           <w:szCs w:val="26"/>
           <w:cs/>
@@ -471,6 +484,7 @@
       </w:r>
       <w:r>
         <w:rPr>
+          <w:rFonts w:asciiTheme="minorBidi" w:hAnsiTheme="minorBidi"/>
           <w:sz w:val="26"/>
           <w:szCs w:val="26"/>
         </w:rPr>
@@ -478,7 +492,7 @@
       </w:r>
       <w:r>
         <w:rPr>
-          <w:rFonts w:cs="Mangal"/>
+          <w:rFonts w:asciiTheme="minorBidi" w:hAnsiTheme="minorBidi"/>
           <w:sz w:val="26"/>
           <w:szCs w:val="26"/>
           <w:cs/>
@@ -488,6 +502,7 @@
       </w:r>
       <w:r>
         <w:rPr>
+          <w:rFonts w:asciiTheme="minorBidi" w:hAnsiTheme="minorBidi"/>
           <w:sz w:val="26"/>
           <w:szCs w:val="26"/>
         </w:rPr>
@@ -495,7 +510,7 @@
       </w:r>
       <w:r>
         <w:rPr>
-          <w:rFonts w:cs="Mangal"/>
+          <w:rFonts w:asciiTheme="minorBidi" w:hAnsiTheme="minorBidi"/>
           <w:sz w:val="26"/>
           <w:szCs w:val="26"/>
           <w:cs/>
@@ -509,13 +524,14 @@
         <w:spacing w:after="0"/>
         <w:ind w:left="2160" w:firstLine="720"/>
         <w:rPr>
-          <w:sz w:val="26"/>
-          <w:szCs w:val="26"/>
-        </w:rPr>
-      </w:pPr>
-      <w:r>
-        <w:rPr>
-          <w:rFonts w:cs="Mangal"/>
+          <w:rFonts w:asciiTheme="minorBidi" w:hAnsiTheme="minorBidi"/>
+          <w:sz w:val="26"/>
+          <w:szCs w:val="26"/>
+        </w:rPr>
+      </w:pPr>
+      <w:r>
+        <w:rPr>
+          <w:rFonts w:asciiTheme="minorBidi" w:hAnsiTheme="minorBidi"/>
           <w:sz w:val="26"/>
           <w:szCs w:val="26"/>
           <w:cs/>
@@ -525,7 +541,7 @@
       </w:r>
       <w:r>
         <w:rPr>
-          <w:rFonts w:cs="Mangal"/>
+          <w:rFonts w:asciiTheme="minorBidi" w:hAnsiTheme="minorBidi"/>
           <w:sz w:val="26"/>
           <w:szCs w:val="26"/>
           <w:lang w:bidi="hi-IN"/>
@@ -534,7 +550,7 @@
       </w:r>
       <w:r>
         <w:rPr>
-          <w:rFonts w:cs="Mangal"/>
+          <w:rFonts w:asciiTheme="minorBidi" w:hAnsiTheme="minorBidi"/>
           <w:sz w:val="26"/>
           <w:szCs w:val="26"/>
           <w:cs/>
@@ -544,6 +560,7 @@
       </w:r>
       <w:r>
         <w:rPr>
+          <w:rFonts w:asciiTheme="minorBidi" w:hAnsiTheme="minorBidi"/>
           <w:sz w:val="26"/>
           <w:szCs w:val="26"/>
         </w:rPr>
@@ -551,7 +568,7 @@
       </w:r>
       <w:r>
         <w:rPr>
-          <w:rFonts w:cs="Mangal"/>
+          <w:rFonts w:asciiTheme="minorBidi" w:hAnsiTheme="minorBidi"/>
           <w:sz w:val="26"/>
           <w:szCs w:val="26"/>
           <w:cs/>
@@ -565,15 +582,15 @@
         <w:spacing w:after="0"/>
         <w:ind w:left="2880"/>
         <w:rPr>
-          <w:rFonts w:cs="Mangal"/>
-          <w:sz w:val="26"/>
-          <w:szCs w:val="26"/>
-          <w:lang w:bidi="hi-IN"/>
-        </w:rPr>
-      </w:pPr>
-      <w:r>
-        <w:rPr>
-          <w:rFonts w:cs="Mangal"/>
+          <w:rFonts w:asciiTheme="minorBidi" w:hAnsiTheme="minorBidi"/>
+          <w:sz w:val="26"/>
+          <w:szCs w:val="26"/>
+          <w:lang w:bidi="hi-IN"/>
+        </w:rPr>
+      </w:pPr>
+      <w:r>
+        <w:rPr>
+          <w:rFonts w:asciiTheme="minorBidi" w:hAnsiTheme="minorBidi"/>
           <w:sz w:val="26"/>
           <w:szCs w:val="26"/>
           <w:cs/>
@@ -583,6 +600,7 @@
       </w:r>
       <w:r>
         <w:rPr>
+          <w:rFonts w:asciiTheme="minorBidi" w:hAnsiTheme="minorBidi"/>
           <w:sz w:val="26"/>
           <w:szCs w:val="26"/>
         </w:rPr>
@@ -590,7 +608,7 @@
       </w:r>
       <w:r>
         <w:rPr>
-          <w:rFonts w:cs="Mangal"/>
+          <w:rFonts w:asciiTheme="minorBidi" w:hAnsiTheme="minorBidi"/>
           <w:sz w:val="26"/>
           <w:szCs w:val="26"/>
           <w:cs/>
@@ -604,13 +622,14 @@
         <w:spacing w:after="0"/>
         <w:ind w:left="2880"/>
         <w:rPr>
-          <w:sz w:val="26"/>
-          <w:szCs w:val="26"/>
-        </w:rPr>
-      </w:pPr>
-      <w:r>
-        <w:rPr>
-          <w:rFonts w:cs="Mangal"/>
+          <w:rFonts w:asciiTheme="minorBidi" w:hAnsiTheme="minorBidi"/>
+          <w:sz w:val="26"/>
+          <w:szCs w:val="26"/>
+        </w:rPr>
+      </w:pPr>
+      <w:r>
+        <w:rPr>
+          <w:rFonts w:asciiTheme="minorBidi" w:hAnsiTheme="minorBidi"/>
           <w:sz w:val="26"/>
           <w:szCs w:val="26"/>
           <w:cs/>
@@ -620,6 +639,7 @@
       </w:r>
       <w:r>
         <w:rPr>
+          <w:rFonts w:asciiTheme="minorBidi" w:hAnsiTheme="minorBidi"/>
           <w:sz w:val="26"/>
           <w:szCs w:val="26"/>
         </w:rPr>
@@ -627,7 +647,7 @@
       </w:r>
       <w:r>
         <w:rPr>
-          <w:rFonts w:cs="Mangal"/>
+          <w:rFonts w:asciiTheme="minorBidi" w:hAnsiTheme="minorBidi"/>
           <w:sz w:val="26"/>
           <w:szCs w:val="26"/>
           <w:cs/>
@@ -637,6 +657,7 @@
       </w:r>
       <w:r>
         <w:rPr>
+          <w:rFonts w:asciiTheme="minorBidi" w:hAnsiTheme="minorBidi"/>
           <w:sz w:val="26"/>
           <w:szCs w:val="26"/>
         </w:rPr>
@@ -644,7 +665,7 @@
       </w:r>
       <w:r>
         <w:rPr>
-          <w:rFonts w:cs="Mangal"/>
+          <w:rFonts w:asciiTheme="minorBidi" w:hAnsiTheme="minorBidi"/>
           <w:sz w:val="26"/>
           <w:szCs w:val="26"/>
           <w:cs/>
@@ -654,6 +675,7 @@
       </w:r>
       <w:r>
         <w:rPr>
+          <w:rFonts w:asciiTheme="minorBidi" w:hAnsiTheme="minorBidi"/>
           <w:sz w:val="26"/>
           <w:szCs w:val="26"/>
         </w:rPr>
@@ -661,7 +683,7 @@
       </w:r>
       <w:r>
         <w:rPr>
-          <w:rFonts w:cs="Mangal"/>
+          <w:rFonts w:asciiTheme="minorBidi" w:hAnsiTheme="minorBidi"/>
           <w:sz w:val="26"/>
           <w:szCs w:val="26"/>
           <w:cs/>
@@ -671,6 +693,7 @@
       </w:r>
       <w:r>
         <w:rPr>
+          <w:rFonts w:asciiTheme="minorBidi" w:hAnsiTheme="minorBidi"/>
           <w:sz w:val="26"/>
           <w:szCs w:val="26"/>
         </w:rPr>
@@ -682,13 +705,14 @@
         <w:spacing w:after="0"/>
         <w:ind w:left="2880"/>
         <w:rPr>
-          <w:sz w:val="26"/>
-          <w:szCs w:val="26"/>
-        </w:rPr>
-      </w:pPr>
-      <w:r>
-        <w:rPr>
-          <w:rFonts w:cs="Mangal"/>
+          <w:rFonts w:asciiTheme="minorBidi" w:hAnsiTheme="minorBidi"/>
+          <w:sz w:val="26"/>
+          <w:szCs w:val="26"/>
+        </w:rPr>
+      </w:pPr>
+      <w:r>
+        <w:rPr>
+          <w:rFonts w:asciiTheme="minorBidi" w:hAnsiTheme="minorBidi"/>
           <w:sz w:val="26"/>
           <w:szCs w:val="26"/>
           <w:cs/>
@@ -702,13 +726,14 @@
         <w:spacing w:after="0"/>
         <w:ind w:left="2160" w:firstLine="720"/>
         <w:rPr>
-          <w:sz w:val="26"/>
-          <w:szCs w:val="26"/>
-        </w:rPr>
-      </w:pPr>
-      <w:r>
-        <w:rPr>
-          <w:rFonts w:cs="Mangal"/>
+          <w:rFonts w:asciiTheme="minorBidi" w:hAnsiTheme="minorBidi"/>
+          <w:sz w:val="26"/>
+          <w:szCs w:val="26"/>
+        </w:rPr>
+      </w:pPr>
+      <w:r>
+        <w:rPr>
+          <w:rFonts w:asciiTheme="minorBidi" w:hAnsiTheme="minorBidi"/>
           <w:sz w:val="26"/>
           <w:szCs w:val="26"/>
           <w:cs/>
@@ -722,13 +747,14 @@
         <w:spacing w:after="0"/>
         <w:ind w:left="2160" w:firstLine="720"/>
         <w:rPr>
-          <w:sz w:val="26"/>
-          <w:szCs w:val="26"/>
-        </w:rPr>
-      </w:pPr>
-      <w:r>
-        <w:rPr>
-          <w:rFonts w:cs="Mangal"/>
+          <w:rFonts w:asciiTheme="minorBidi" w:hAnsiTheme="minorBidi"/>
+          <w:sz w:val="26"/>
+          <w:szCs w:val="26"/>
+        </w:rPr>
+      </w:pPr>
+      <w:r>
+        <w:rPr>
+          <w:rFonts w:asciiTheme="minorBidi" w:hAnsiTheme="minorBidi"/>
           <w:sz w:val="26"/>
           <w:szCs w:val="26"/>
           <w:cs/>
@@ -738,7 +764,7 @@
       </w:r>
       <w:r>
         <w:rPr>
-          <w:rFonts w:cs="Mangal"/>
+          <w:rFonts w:asciiTheme="minorBidi" w:hAnsiTheme="minorBidi"/>
           <w:sz w:val="26"/>
           <w:szCs w:val="26"/>
           <w:lang w:bidi="hi-IN"/>
@@ -747,7 +773,7 @@
       </w:r>
       <w:r>
         <w:rPr>
-          <w:rFonts w:cs="Mangal"/>
+          <w:rFonts w:asciiTheme="minorBidi" w:hAnsiTheme="minorBidi"/>
           <w:sz w:val="26"/>
           <w:szCs w:val="26"/>
           <w:cs/>
@@ -757,6 +783,7 @@
       </w:r>
       <w:r>
         <w:rPr>
+          <w:rFonts w:asciiTheme="minorBidi" w:hAnsiTheme="minorBidi"/>
           <w:sz w:val="26"/>
           <w:szCs w:val="26"/>
         </w:rPr>
@@ -764,7 +791,7 @@
       </w:r>
       <w:r>
         <w:rPr>
-          <w:rFonts w:cs="Mangal"/>
+          <w:rFonts w:asciiTheme="minorBidi" w:hAnsiTheme="minorBidi"/>
           <w:sz w:val="26"/>
           <w:szCs w:val="26"/>
           <w:cs/>
@@ -778,15 +805,15 @@
         <w:spacing w:after="0"/>
         <w:ind w:left="2880"/>
         <w:rPr>
-          <w:rFonts w:cs="Mangal"/>
-          <w:sz w:val="26"/>
-          <w:szCs w:val="26"/>
-          <w:lang w:bidi="hi-IN"/>
-        </w:rPr>
-      </w:pPr>
-      <w:r>
-        <w:rPr>
-          <w:rFonts w:cs="Mangal"/>
+          <w:rFonts w:asciiTheme="minorBidi" w:hAnsiTheme="minorBidi"/>
+          <w:sz w:val="26"/>
+          <w:szCs w:val="26"/>
+          <w:lang w:bidi="hi-IN"/>
+        </w:rPr>
+      </w:pPr>
+      <w:r>
+        <w:rPr>
+          <w:rFonts w:asciiTheme="minorBidi" w:hAnsiTheme="minorBidi"/>
           <w:sz w:val="26"/>
           <w:szCs w:val="26"/>
           <w:cs/>
@@ -796,6 +823,7 @@
       </w:r>
       <w:r>
         <w:rPr>
+          <w:rFonts w:asciiTheme="minorBidi" w:hAnsiTheme="minorBidi"/>
           <w:sz w:val="26"/>
           <w:szCs w:val="26"/>
         </w:rPr>
@@ -803,7 +831,7 @@
       </w:r>
       <w:r>
         <w:rPr>
-          <w:rFonts w:cs="Mangal"/>
+          <w:rFonts w:asciiTheme="minorBidi" w:hAnsiTheme="minorBidi"/>
           <w:sz w:val="26"/>
           <w:szCs w:val="26"/>
           <w:cs/>
@@ -813,6 +841,7 @@
       </w:r>
       <w:r>
         <w:rPr>
+          <w:rFonts w:asciiTheme="minorBidi" w:hAnsiTheme="minorBidi"/>
           <w:sz w:val="26"/>
           <w:szCs w:val="26"/>
         </w:rPr>
@@ -820,7 +849,7 @@
       </w:r>
       <w:r>
         <w:rPr>
-          <w:rFonts w:cs="Mangal"/>
+          <w:rFonts w:asciiTheme="minorBidi" w:hAnsiTheme="minorBidi"/>
           <w:sz w:val="26"/>
           <w:szCs w:val="26"/>
           <w:cs/>
@@ -834,13 +863,14 @@
         <w:spacing w:after="0"/>
         <w:ind w:left="2880"/>
         <w:rPr>
-          <w:sz w:val="26"/>
-          <w:szCs w:val="26"/>
-        </w:rPr>
-      </w:pPr>
-      <w:r>
-        <w:rPr>
-          <w:rFonts w:cs="Mangal"/>
+          <w:rFonts w:asciiTheme="minorBidi" w:hAnsiTheme="minorBidi"/>
+          <w:sz w:val="26"/>
+          <w:szCs w:val="26"/>
+        </w:rPr>
+      </w:pPr>
+      <w:r>
+        <w:rPr>
+          <w:rFonts w:asciiTheme="minorBidi" w:hAnsiTheme="minorBidi"/>
           <w:sz w:val="26"/>
           <w:szCs w:val="26"/>
           <w:cs/>
@@ -850,6 +880,7 @@
       </w:r>
       <w:r>
         <w:rPr>
+          <w:rFonts w:asciiTheme="minorBidi" w:hAnsiTheme="minorBidi"/>
           <w:sz w:val="26"/>
           <w:szCs w:val="26"/>
         </w:rPr>
@@ -857,7 +888,7 @@
       </w:r>
       <w:r>
         <w:rPr>
-          <w:rFonts w:cs="Mangal"/>
+          <w:rFonts w:asciiTheme="minorBidi" w:hAnsiTheme="minorBidi"/>
           <w:sz w:val="26"/>
           <w:szCs w:val="26"/>
           <w:cs/>
@@ -867,6 +898,7 @@
       </w:r>
       <w:r>
         <w:rPr>
+          <w:rFonts w:asciiTheme="minorBidi" w:hAnsiTheme="minorBidi"/>
           <w:sz w:val="26"/>
           <w:szCs w:val="26"/>
         </w:rPr>
@@ -878,13 +910,14 @@
         <w:spacing w:after="0"/>
         <w:ind w:left="2880"/>
         <w:rPr>
-          <w:sz w:val="28"/>
-          <w:szCs w:val="28"/>
-        </w:rPr>
-      </w:pPr>
-      <w:r>
-        <w:rPr>
-          <w:rFonts w:cs="Mangal"/>
+          <w:rFonts w:asciiTheme="minorBidi" w:hAnsiTheme="minorBidi"/>
+          <w:sz w:val="28"/>
+          <w:szCs w:val="28"/>
+        </w:rPr>
+      </w:pPr>
+      <w:r>
+        <w:rPr>
+          <w:rFonts w:asciiTheme="minorBidi" w:hAnsiTheme="minorBidi"/>
           <w:sz w:val="26"/>
           <w:szCs w:val="26"/>
           <w:cs/>
@@ -894,6 +927,7 @@
       </w:r>
       <w:r>
         <w:rPr>
+          <w:rFonts w:asciiTheme="minorBidi" w:hAnsiTheme="minorBidi"/>
           <w:sz w:val="26"/>
           <w:szCs w:val="26"/>
         </w:rPr>
@@ -901,7 +935,7 @@
       </w:r>
       <w:r>
         <w:rPr>
-          <w:rFonts w:cs="Mangal"/>
+          <w:rFonts w:asciiTheme="minorBidi" w:hAnsiTheme="minorBidi"/>
           <w:sz w:val="26"/>
           <w:szCs w:val="26"/>
           <w:cs/>
@@ -911,21 +945,15 @@
       </w:r>
       <w:r>
         <w:rPr>
-          <w:sz w:val="26"/>
-          <w:szCs w:val="26"/>
-        </w:rPr>
-        <w:t>,</w:t>
-      </w:r>
-      <w:r>
-        <w:rPr>
-          <w:sz w:val="26"/>
-          <w:szCs w:val="26"/>
-        </w:rPr>
-        <w:t xml:space="preserve">  </w:t>
-      </w:r>
-      <w:r>
-        <w:rPr>
-          <w:rFonts w:cs="Mangal"/>
+          <w:rFonts w:asciiTheme="minorBidi" w:hAnsiTheme="minorBidi"/>
+          <w:sz w:val="26"/>
+          <w:szCs w:val="26"/>
+        </w:rPr>
+        <w:t xml:space="preserve">,  </w:t>
+      </w:r>
+      <w:r>
+        <w:rPr>
+          <w:rFonts w:asciiTheme="minorBidi" w:hAnsiTheme="minorBidi"/>
           <w:sz w:val="26"/>
           <w:szCs w:val="26"/>
           <w:cs/>
@@ -939,7 +967,7 @@
         <w:spacing w:after="0"/>
         <w:ind w:left="2880" w:firstLine="720"/>
         <w:rPr>
-          <w:rFonts w:cs="Mangal"/>
+          <w:rFonts w:asciiTheme="minorBidi" w:hAnsiTheme="minorBidi"/>
           <w:b/>
           <w:bCs/>
           <w:sz w:val="32"/>
@@ -954,7 +982,7 @@
         <w:spacing w:after="0"/>
         <w:ind w:left="2880" w:firstLine="720"/>
         <w:rPr>
-          <w:rFonts w:cs="Mangal"/>
+          <w:rFonts w:asciiTheme="minorBidi" w:hAnsiTheme="minorBidi"/>
           <w:b/>
           <w:bCs/>
           <w:sz w:val="32"/>
@@ -969,7 +997,7 @@
         <w:spacing w:after="0"/>
         <w:ind w:left="2880" w:firstLine="720"/>
         <w:rPr>
-          <w:rFonts w:cs="Mangal"/>
+          <w:rFonts w:asciiTheme="minorBidi" w:hAnsiTheme="minorBidi"/>
           <w:b/>
           <w:bCs/>
           <w:sz w:val="32"/>
@@ -984,7 +1012,7 @@
         <w:spacing w:after="0"/>
         <w:ind w:left="2880" w:firstLine="720"/>
         <w:rPr>
-          <w:rFonts w:cs="Mangal"/>
+          <w:rFonts w:asciiTheme="minorBidi" w:hAnsiTheme="minorBidi"/>
           <w:b/>
           <w:bCs/>
           <w:sz w:val="32"/>
@@ -999,7 +1027,7 @@
         <w:spacing w:after="0"/>
         <w:ind w:left="2880" w:firstLine="720"/>
         <w:rPr>
-          <w:rFonts w:cs="Mangal"/>
+          <w:rFonts w:asciiTheme="minorBidi" w:hAnsiTheme="minorBidi"/>
           <w:b/>
           <w:bCs/>
           <w:sz w:val="32"/>
@@ -1014,7 +1042,7 @@
         <w:spacing w:after="0"/>
         <w:ind w:left="2880" w:firstLine="720"/>
         <w:rPr>
-          <w:rFonts w:cs="Mangal"/>
+          <w:rFonts w:asciiTheme="minorBidi" w:hAnsiTheme="minorBidi"/>
           <w:b/>
           <w:bCs/>
           <w:sz w:val="32"/>
@@ -1029,7 +1057,7 @@
         <w:spacing w:after="0"/>
         <w:ind w:left="2880" w:firstLine="720"/>
         <w:rPr>
-          <w:rFonts w:cs="Mangal"/>
+          <w:rFonts w:asciiTheme="minorBidi" w:hAnsiTheme="minorBidi"/>
           <w:b/>
           <w:bCs/>
           <w:sz w:val="32"/>
@@ -1044,7 +1072,7 @@
         <w:spacing w:after="0"/>
         <w:ind w:left="2880" w:firstLine="720"/>
         <w:rPr>
-          <w:rFonts w:cs="Mangal"/>
+          <w:rFonts w:asciiTheme="minorBidi" w:hAnsiTheme="minorBidi"/>
           <w:b/>
           <w:bCs/>
           <w:sz w:val="32"/>
@@ -1059,6 +1087,7 @@
         <w:spacing w:after="0"/>
         <w:ind w:left="2880" w:firstLine="720"/>
         <w:rPr>
+          <w:rFonts w:asciiTheme="minorBidi" w:hAnsiTheme="minorBidi"/>
           <w:b/>
           <w:bCs/>
           <w:sz w:val="32"/>
@@ -1068,7 +1097,7 @@
       </w:pPr>
       <w:r>
         <w:rPr>
-          <w:rFonts w:cs="Mangal"/>
+          <w:rFonts w:asciiTheme="minorBidi" w:hAnsiTheme="minorBidi"/>
           <w:b/>
           <w:bCs/>
           <w:sz w:val="32"/>
@@ -1077,7 +1106,6 @@
           <w:cs/>
           <w:lang w:bidi="hi-IN"/>
         </w:rPr>
-        <w:lastRenderedPageBreak/>
         <w:t>शपथपत्र</w:t>
       </w:r>
     </w:p>
@@ -1085,22 +1113,24 @@
       <w:pPr>
         <w:spacing w:after="0"/>
         <w:rPr>
-          <w:sz w:val="28"/>
-          <w:szCs w:val="28"/>
-        </w:rPr>
-      </w:pPr>
-    </w:p>
-    <w:p>
-      <w:pPr>
-        <w:spacing w:after="0"/>
-        <w:rPr>
-          <w:sz w:val="28"/>
-          <w:szCs w:val="28"/>
-        </w:rPr>
-      </w:pPr>
-      <w:r>
-        <w:rPr>
-          <w:rFonts w:cs="Mangal"/>
+          <w:rFonts w:asciiTheme="minorBidi" w:hAnsiTheme="minorBidi"/>
+          <w:sz w:val="28"/>
+          <w:szCs w:val="28"/>
+        </w:rPr>
+      </w:pPr>
+    </w:p>
+    <w:p>
+      <w:pPr>
+        <w:spacing w:after="0"/>
+        <w:rPr>
+          <w:rFonts w:asciiTheme="minorBidi" w:hAnsiTheme="minorBidi"/>
+          <w:sz w:val="28"/>
+          <w:szCs w:val="28"/>
+        </w:rPr>
+      </w:pPr>
+      <w:r>
+        <w:rPr>
+          <w:rFonts w:asciiTheme="minorBidi" w:hAnsiTheme="minorBidi"/>
           <w:sz w:val="28"/>
           <w:szCs w:val="28"/>
           <w:cs/>
@@ -1110,6 +1140,7 @@
       </w:r>
       <w:r>
         <w:rPr>
+          <w:rFonts w:asciiTheme="minorBidi" w:hAnsiTheme="minorBidi"/>
           <w:sz w:val="28"/>
           <w:szCs w:val="28"/>
         </w:rPr>
@@ -1117,7 +1148,7 @@
       </w:r>
       <w:r>
         <w:rPr>
-          <w:rFonts w:cs="Mangal"/>
+          <w:rFonts w:asciiTheme="minorBidi" w:hAnsiTheme="minorBidi"/>
           <w:sz w:val="28"/>
           <w:szCs w:val="28"/>
           <w:cs/>
@@ -1136,13 +1167,14 @@
         <w:spacing w:after="0"/>
         <w:jc w:val="both"/>
         <w:rPr>
-          <w:sz w:val="28"/>
-          <w:szCs w:val="28"/>
-        </w:rPr>
-      </w:pPr>
-      <w:r>
-        <w:rPr>
-          <w:rFonts w:cs="Mangal"/>
+          <w:rFonts w:asciiTheme="minorBidi" w:hAnsiTheme="minorBidi"/>
+          <w:sz w:val="28"/>
+          <w:szCs w:val="28"/>
+        </w:rPr>
+      </w:pPr>
+      <w:r>
+        <w:rPr>
+          <w:rFonts w:asciiTheme="minorBidi" w:hAnsiTheme="minorBidi"/>
           <w:sz w:val="28"/>
           <w:szCs w:val="28"/>
           <w:cs/>
@@ -1161,13 +1193,14 @@
         <w:spacing w:after="0"/>
         <w:jc w:val="both"/>
         <w:rPr>
-          <w:sz w:val="28"/>
-          <w:szCs w:val="28"/>
-        </w:rPr>
-      </w:pPr>
-      <w:r>
-        <w:rPr>
-          <w:rFonts w:cs="Mangal"/>
+          <w:rFonts w:asciiTheme="minorBidi" w:hAnsiTheme="minorBidi"/>
+          <w:sz w:val="28"/>
+          <w:szCs w:val="28"/>
+        </w:rPr>
+      </w:pPr>
+      <w:r>
+        <w:rPr>
+          <w:rFonts w:asciiTheme="minorBidi" w:hAnsiTheme="minorBidi"/>
           <w:sz w:val="28"/>
           <w:szCs w:val="28"/>
           <w:cs/>
@@ -1177,6 +1210,7 @@
       </w:r>
       <w:r>
         <w:rPr>
+          <w:rFonts w:asciiTheme="minorBidi" w:hAnsiTheme="minorBidi"/>
           <w:sz w:val="28"/>
           <w:szCs w:val="28"/>
         </w:rPr>
@@ -1184,7 +1218,7 @@
       </w:r>
       <w:r>
         <w:rPr>
-          <w:rFonts w:cs="Mangal"/>
+          <w:rFonts w:asciiTheme="minorBidi" w:hAnsiTheme="minorBidi"/>
           <w:sz w:val="28"/>
           <w:szCs w:val="28"/>
           <w:cs/>
@@ -1194,6 +1228,7 @@
       </w:r>
       <w:r>
         <w:rPr>
+          <w:rFonts w:asciiTheme="minorBidi" w:hAnsiTheme="minorBidi"/>
           <w:sz w:val="28"/>
           <w:szCs w:val="28"/>
         </w:rPr>
@@ -1201,7 +1236,7 @@
       </w:r>
       <w:r>
         <w:rPr>
-          <w:rFonts w:cs="Mangal"/>
+          <w:rFonts w:asciiTheme="minorBidi" w:hAnsiTheme="minorBidi"/>
           <w:sz w:val="28"/>
           <w:szCs w:val="28"/>
           <w:cs/>
@@ -1211,6 +1246,7 @@
       </w:r>
       <w:r>
         <w:rPr>
+          <w:rFonts w:asciiTheme="minorBidi" w:hAnsiTheme="minorBidi"/>
           <w:sz w:val="28"/>
           <w:szCs w:val="28"/>
         </w:rPr>
@@ -1218,7 +1254,7 @@
       </w:r>
       <w:r>
         <w:rPr>
-          <w:rFonts w:cs="Mangal"/>
+          <w:rFonts w:asciiTheme="minorBidi" w:hAnsiTheme="minorBidi"/>
           <w:sz w:val="28"/>
           <w:szCs w:val="28"/>
           <w:cs/>
@@ -1228,6 +1264,7 @@
       </w:r>
       <w:r>
         <w:rPr>
+          <w:rFonts w:asciiTheme="minorBidi" w:hAnsiTheme="minorBidi"/>
           <w:sz w:val="28"/>
           <w:szCs w:val="28"/>
         </w:rPr>
@@ -1235,7 +1272,7 @@
       </w:r>
       <w:r>
         <w:rPr>
-          <w:rFonts w:cs="Mangal"/>
+          <w:rFonts w:asciiTheme="minorBidi" w:hAnsiTheme="minorBidi"/>
           <w:sz w:val="28"/>
           <w:szCs w:val="28"/>
           <w:cs/>
@@ -1254,13 +1291,14 @@
         <w:spacing w:after="0"/>
         <w:jc w:val="both"/>
         <w:rPr>
-          <w:sz w:val="28"/>
-          <w:szCs w:val="28"/>
-        </w:rPr>
-      </w:pPr>
-      <w:r>
-        <w:rPr>
-          <w:rFonts w:cs="Mangal"/>
+          <w:rFonts w:asciiTheme="minorBidi" w:hAnsiTheme="minorBidi"/>
+          <w:sz w:val="28"/>
+          <w:szCs w:val="28"/>
+        </w:rPr>
+      </w:pPr>
+      <w:r>
+        <w:rPr>
+          <w:rFonts w:asciiTheme="minorBidi" w:hAnsiTheme="minorBidi"/>
           <w:sz w:val="28"/>
           <w:szCs w:val="28"/>
           <w:cs/>
@@ -1279,13 +1317,14 @@
         <w:spacing w:after="0"/>
         <w:jc w:val="both"/>
         <w:rPr>
-          <w:sz w:val="28"/>
-          <w:szCs w:val="28"/>
-        </w:rPr>
-      </w:pPr>
-      <w:r>
-        <w:rPr>
-          <w:rFonts w:cs="Mangal"/>
+          <w:rFonts w:asciiTheme="minorBidi" w:hAnsiTheme="minorBidi"/>
+          <w:sz w:val="28"/>
+          <w:szCs w:val="28"/>
+        </w:rPr>
+      </w:pPr>
+      <w:r>
+        <w:rPr>
+          <w:rFonts w:asciiTheme="minorBidi" w:hAnsiTheme="minorBidi"/>
           <w:sz w:val="28"/>
           <w:szCs w:val="28"/>
           <w:cs/>
@@ -1295,6 +1334,7 @@
       </w:r>
       <w:r>
         <w:rPr>
+          <w:rFonts w:asciiTheme="minorBidi" w:hAnsiTheme="minorBidi"/>
           <w:sz w:val="28"/>
           <w:szCs w:val="28"/>
         </w:rPr>
@@ -1302,7 +1342,7 @@
       </w:r>
       <w:r>
         <w:rPr>
-          <w:rFonts w:cs="Mangal"/>
+          <w:rFonts w:asciiTheme="minorBidi" w:hAnsiTheme="minorBidi"/>
           <w:sz w:val="28"/>
           <w:szCs w:val="28"/>
           <w:cs/>
@@ -1312,6 +1352,7 @@
       </w:r>
       <w:r>
         <w:rPr>
+          <w:rFonts w:asciiTheme="minorBidi" w:hAnsiTheme="minorBidi"/>
           <w:sz w:val="28"/>
           <w:szCs w:val="28"/>
         </w:rPr>
@@ -1319,7 +1360,7 @@
       </w:r>
       <w:r>
         <w:rPr>
-          <w:rFonts w:cs="Mangal"/>
+          <w:rFonts w:asciiTheme="minorBidi" w:hAnsiTheme="minorBidi"/>
           <w:sz w:val="28"/>
           <w:szCs w:val="28"/>
           <w:cs/>
@@ -1338,13 +1379,14 @@
         <w:spacing w:after="0"/>
         <w:jc w:val="both"/>
         <w:rPr>
-          <w:sz w:val="28"/>
-          <w:szCs w:val="28"/>
-        </w:rPr>
-      </w:pPr>
-      <w:r>
-        <w:rPr>
-          <w:rFonts w:cs="Mangal"/>
+          <w:rFonts w:asciiTheme="minorBidi" w:hAnsiTheme="minorBidi"/>
+          <w:sz w:val="28"/>
+          <w:szCs w:val="28"/>
+        </w:rPr>
+      </w:pPr>
+      <w:r>
+        <w:rPr>
+          <w:rFonts w:asciiTheme="minorBidi" w:hAnsiTheme="minorBidi"/>
           <w:sz w:val="28"/>
           <w:szCs w:val="28"/>
           <w:cs/>
@@ -1363,13 +1405,14 @@
         <w:spacing w:after="0"/>
         <w:jc w:val="both"/>
         <w:rPr>
-          <w:sz w:val="28"/>
-          <w:szCs w:val="28"/>
-        </w:rPr>
-      </w:pPr>
-      <w:r>
-        <w:rPr>
-          <w:rFonts w:cs="Mangal"/>
+          <w:rFonts w:asciiTheme="minorBidi" w:hAnsiTheme="minorBidi"/>
+          <w:sz w:val="28"/>
+          <w:szCs w:val="28"/>
+        </w:rPr>
+      </w:pPr>
+      <w:r>
+        <w:rPr>
+          <w:rFonts w:asciiTheme="minorBidi" w:hAnsiTheme="minorBidi"/>
           <w:sz w:val="28"/>
           <w:szCs w:val="28"/>
           <w:cs/>
@@ -1379,6 +1422,7 @@
       </w:r>
       <w:r>
         <w:rPr>
+          <w:rFonts w:asciiTheme="minorBidi" w:hAnsiTheme="minorBidi"/>
           <w:sz w:val="28"/>
           <w:szCs w:val="28"/>
         </w:rPr>
@@ -1386,7 +1430,7 @@
       </w:r>
       <w:r>
         <w:rPr>
-          <w:rFonts w:cs="Mangal"/>
+          <w:rFonts w:asciiTheme="minorBidi" w:hAnsiTheme="minorBidi"/>
           <w:sz w:val="28"/>
           <w:szCs w:val="28"/>
           <w:cs/>
@@ -1405,13 +1449,14 @@
         <w:spacing w:after="0"/>
         <w:jc w:val="both"/>
         <w:rPr>
-          <w:sz w:val="28"/>
-          <w:szCs w:val="28"/>
-        </w:rPr>
-      </w:pPr>
-      <w:r>
-        <w:rPr>
-          <w:rFonts w:cs="Mangal"/>
+          <w:rFonts w:asciiTheme="minorBidi" w:hAnsiTheme="minorBidi"/>
+          <w:sz w:val="28"/>
+          <w:szCs w:val="28"/>
+        </w:rPr>
+      </w:pPr>
+      <w:r>
+        <w:rPr>
+          <w:rFonts w:asciiTheme="minorBidi" w:hAnsiTheme="minorBidi"/>
           <w:sz w:val="28"/>
           <w:szCs w:val="28"/>
           <w:cs/>
@@ -1430,13 +1475,14 @@
         <w:spacing w:after="0"/>
         <w:jc w:val="both"/>
         <w:rPr>
-          <w:sz w:val="28"/>
-          <w:szCs w:val="28"/>
-        </w:rPr>
-      </w:pPr>
-      <w:r>
-        <w:rPr>
-          <w:rFonts w:cs="Mangal"/>
+          <w:rFonts w:asciiTheme="minorBidi" w:hAnsiTheme="minorBidi"/>
+          <w:sz w:val="28"/>
+          <w:szCs w:val="28"/>
+        </w:rPr>
+      </w:pPr>
+      <w:r>
+        <w:rPr>
+          <w:rFonts w:asciiTheme="minorBidi" w:hAnsiTheme="minorBidi"/>
           <w:sz w:val="28"/>
           <w:szCs w:val="28"/>
           <w:cs/>
@@ -1455,13 +1501,14 @@
         <w:spacing w:after="0"/>
         <w:jc w:val="both"/>
         <w:rPr>
-          <w:sz w:val="28"/>
-          <w:szCs w:val="28"/>
-        </w:rPr>
-      </w:pPr>
-      <w:r>
-        <w:rPr>
-          <w:rFonts w:cs="Mangal"/>
+          <w:rFonts w:asciiTheme="minorBidi" w:hAnsiTheme="minorBidi"/>
+          <w:sz w:val="28"/>
+          <w:szCs w:val="28"/>
+        </w:rPr>
+      </w:pPr>
+      <w:r>
+        <w:rPr>
+          <w:rFonts w:asciiTheme="minorBidi" w:hAnsiTheme="minorBidi"/>
           <w:sz w:val="28"/>
           <w:szCs w:val="28"/>
           <w:cs/>
@@ -1474,32 +1521,35 @@
       <w:pPr>
         <w:spacing w:after="0"/>
         <w:rPr>
-          <w:sz w:val="28"/>
-          <w:szCs w:val="28"/>
-        </w:rPr>
-      </w:pPr>
-    </w:p>
-    <w:p>
-      <w:pPr>
-        <w:spacing w:after="0"/>
-        <w:rPr>
-          <w:sz w:val="28"/>
-          <w:szCs w:val="28"/>
-        </w:rPr>
-      </w:pPr>
-      <w:r>
-        <w:rPr>
-          <w:rFonts w:cs="Mangal"/>
-          <w:sz w:val="28"/>
-          <w:szCs w:val="28"/>
-          <w:cs/>
-          <w:lang w:bidi="hi-IN"/>
-        </w:rPr>
+          <w:rFonts w:asciiTheme="minorBidi" w:hAnsiTheme="minorBidi"/>
+          <w:sz w:val="28"/>
+          <w:szCs w:val="28"/>
+        </w:rPr>
+      </w:pPr>
+    </w:p>
+    <w:p>
+      <w:pPr>
+        <w:spacing w:after="0"/>
+        <w:rPr>
+          <w:rFonts w:asciiTheme="minorBidi" w:hAnsiTheme="minorBidi"/>
+          <w:sz w:val="28"/>
+          <w:szCs w:val="28"/>
+        </w:rPr>
+      </w:pPr>
+      <w:r>
+        <w:rPr>
+          <w:rFonts w:asciiTheme="minorBidi" w:hAnsiTheme="minorBidi"/>
+          <w:sz w:val="28"/>
+          <w:szCs w:val="28"/>
+          <w:cs/>
+          <w:lang w:bidi="hi-IN"/>
+        </w:rPr>
+        <w:lastRenderedPageBreak/>
         <w:t>स्थळ : नागपूर</w:t>
       </w:r>
       <w:r>
         <w:rPr>
-          <w:rFonts w:cs="Mangal"/>
+          <w:rFonts w:asciiTheme="minorBidi" w:hAnsiTheme="minorBidi"/>
           <w:sz w:val="28"/>
           <w:szCs w:val="28"/>
           <w:lang w:bidi="hi-IN"/>
@@ -1508,7 +1558,7 @@
       </w:r>
       <w:r>
         <w:rPr>
-          <w:rFonts w:cs="Mangal"/>
+          <w:rFonts w:asciiTheme="minorBidi" w:hAnsiTheme="minorBidi"/>
           <w:sz w:val="28"/>
           <w:szCs w:val="28"/>
           <w:lang w:bidi="hi-IN"/>
@@ -1517,7 +1567,7 @@
       </w:r>
       <w:r>
         <w:rPr>
-          <w:rFonts w:cs="Mangal"/>
+          <w:rFonts w:asciiTheme="minorBidi" w:hAnsiTheme="minorBidi"/>
           <w:sz w:val="28"/>
           <w:szCs w:val="28"/>
           <w:lang w:bidi="hi-IN"/>
@@ -1526,7 +1576,7 @@
       </w:r>
       <w:r>
         <w:rPr>
-          <w:rFonts w:cs="Mangal"/>
+          <w:rFonts w:asciiTheme="minorBidi" w:hAnsiTheme="minorBidi"/>
           <w:sz w:val="28"/>
           <w:szCs w:val="28"/>
           <w:lang w:bidi="hi-IN"/>
@@ -1538,13 +1588,14 @@
       <w:pPr>
         <w:spacing w:after="0"/>
         <w:rPr>
-          <w:sz w:val="28"/>
-          <w:szCs w:val="28"/>
-        </w:rPr>
-      </w:pPr>
-      <w:r>
-        <w:rPr>
-          <w:rFonts w:cs="Mangal"/>
+          <w:rFonts w:asciiTheme="minorBidi" w:hAnsiTheme="minorBidi"/>
+          <w:sz w:val="28"/>
+          <w:szCs w:val="28"/>
+        </w:rPr>
+      </w:pPr>
+      <w:r>
+        <w:rPr>
+          <w:rFonts w:asciiTheme="minorBidi" w:hAnsiTheme="minorBidi"/>
           <w:sz w:val="28"/>
           <w:szCs w:val="28"/>
           <w:cs/>
@@ -1554,7 +1605,7 @@
       </w:r>
       <w:r>
         <w:rPr>
-          <w:rFonts w:cs="Mangal"/>
+          <w:rFonts w:asciiTheme="minorBidi" w:hAnsiTheme="minorBidi"/>
           <w:sz w:val="28"/>
           <w:szCs w:val="28"/>
           <w:lang w:bidi="hi-IN"/>
@@ -1563,7 +1614,7 @@
       </w:r>
       <w:r>
         <w:rPr>
-          <w:rFonts w:cs="Mangal"/>
+          <w:rFonts w:asciiTheme="minorBidi" w:hAnsiTheme="minorBidi"/>
           <w:sz w:val="28"/>
           <w:szCs w:val="28"/>
           <w:lang w:bidi="hi-IN"/>
@@ -1572,7 +1623,7 @@
       </w:r>
       <w:r>
         <w:rPr>
-          <w:rFonts w:cs="Mangal"/>
+          <w:rFonts w:asciiTheme="minorBidi" w:hAnsiTheme="minorBidi"/>
           <w:sz w:val="28"/>
           <w:szCs w:val="28"/>
           <w:lang w:bidi="hi-IN"/>
@@ -1581,7 +1632,7 @@
       </w:r>
       <w:r>
         <w:rPr>
-          <w:rFonts w:cs="Mangal"/>
+          <w:rFonts w:asciiTheme="minorBidi" w:hAnsiTheme="minorBidi"/>
           <w:sz w:val="28"/>
           <w:szCs w:val="28"/>
           <w:lang w:bidi="hi-IN"/>
@@ -1590,7 +1641,7 @@
       </w:r>
       <w:r>
         <w:rPr>
-          <w:rFonts w:cs="Mangal"/>
+          <w:rFonts w:asciiTheme="minorBidi" w:hAnsiTheme="minorBidi"/>
           <w:sz w:val="28"/>
           <w:szCs w:val="28"/>
           <w:lang w:bidi="hi-IN"/>
@@ -1599,7 +1650,7 @@
       </w:r>
       <w:r>
         <w:rPr>
-          <w:rFonts w:cs="Mangal"/>
+          <w:rFonts w:asciiTheme="minorBidi" w:hAnsiTheme="minorBidi"/>
           <w:sz w:val="28"/>
           <w:szCs w:val="28"/>
           <w:lang w:bidi="hi-IN"/>
@@ -1608,7 +1659,7 @@
       </w:r>
       <w:r>
         <w:rPr>
-          <w:rFonts w:cs="Mangal"/>
+          <w:rFonts w:asciiTheme="minorBidi" w:hAnsiTheme="minorBidi"/>
           <w:sz w:val="28"/>
           <w:szCs w:val="28"/>
           <w:lang w:bidi="hi-IN"/>
@@ -1617,7 +1668,7 @@
       </w:r>
       <w:r>
         <w:rPr>
-          <w:rFonts w:cs="Mangal"/>
+          <w:rFonts w:asciiTheme="minorBidi" w:hAnsiTheme="minorBidi"/>
           <w:sz w:val="28"/>
           <w:szCs w:val="28"/>
           <w:cs/>
@@ -1631,12 +1682,14 @@
         <w:spacing w:after="0"/>
         <w:ind w:left="5760"/>
         <w:rPr>
-          <w:sz w:val="28"/>
-          <w:szCs w:val="28"/>
-        </w:rPr>
-      </w:pPr>
-      <w:r>
-        <w:rPr>
+          <w:rFonts w:asciiTheme="minorBidi" w:hAnsiTheme="minorBidi"/>
+          <w:sz w:val="28"/>
+          <w:szCs w:val="28"/>
+        </w:rPr>
+      </w:pPr>
+      <w:r>
+        <w:rPr>
+          <w:rFonts w:asciiTheme="minorBidi" w:hAnsiTheme="minorBidi"/>
           <w:sz w:val="28"/>
           <w:szCs w:val="28"/>
         </w:rPr>
@@ -1648,6 +1701,7 @@
         <w:spacing w:after="0"/>
         <w:ind w:left="5760"/>
         <w:rPr>
+          <w:rFonts w:asciiTheme="minorBidi" w:hAnsiTheme="minorBidi"/>
           <w:sz w:val="28"/>
           <w:szCs w:val="28"/>
         </w:rPr>
@@ -1658,12 +1712,14 @@
         <w:spacing w:after="0"/>
         <w:ind w:left="5760"/>
         <w:rPr>
-          <w:sz w:val="28"/>
-          <w:szCs w:val="28"/>
-        </w:rPr>
-      </w:pPr>
-      <w:r>
-        <w:rPr>
+          <w:rFonts w:asciiTheme="minorBidi" w:hAnsiTheme="minorBidi"/>
+          <w:sz w:val="28"/>
+          <w:szCs w:val="28"/>
+        </w:rPr>
+      </w:pPr>
+      <w:r>
+        <w:rPr>
+          <w:rFonts w:asciiTheme="minorBidi" w:hAnsiTheme="minorBidi"/>
           <w:sz w:val="28"/>
           <w:szCs w:val="28"/>
         </w:rPr>
@@ -1675,7 +1731,7 @@
         <w:spacing w:after="0"/>
         <w:ind w:left="2880" w:firstLine="720"/>
         <w:rPr>
-          <w:rFonts w:cs="Mangal"/>
+          <w:rFonts w:asciiTheme="minorBidi" w:hAnsiTheme="minorBidi"/>
           <w:b/>
           <w:bCs/>
           <w:sz w:val="32"/>
@@ -1690,7 +1746,7 @@
         <w:spacing w:after="0"/>
         <w:ind w:left="2880" w:firstLine="720"/>
         <w:rPr>
-          <w:rFonts w:cs="Mangal"/>
+          <w:rFonts w:asciiTheme="minorBidi" w:hAnsiTheme="minorBidi"/>
           <w:b/>
           <w:bCs/>
           <w:sz w:val="32"/>
@@ -1705,6 +1761,7 @@
         <w:spacing w:after="0"/>
         <w:ind w:left="2880" w:firstLine="720"/>
         <w:rPr>
+          <w:rFonts w:asciiTheme="minorBidi" w:hAnsiTheme="minorBidi"/>
           <w:b/>
           <w:bCs/>
           <w:sz w:val="32"/>
@@ -1714,7 +1771,7 @@
       </w:pPr>
       <w:r>
         <w:rPr>
-          <w:rFonts w:cs="Mangal"/>
+          <w:rFonts w:asciiTheme="minorBidi" w:hAnsiTheme="minorBidi"/>
           <w:b/>
           <w:bCs/>
           <w:sz w:val="32"/>
@@ -1723,7 +1780,6 @@
           <w:cs/>
           <w:lang w:bidi="hi-IN"/>
         </w:rPr>
-        <w:lastRenderedPageBreak/>
         <w:t>सत्यापन</w:t>
       </w:r>
     </w:p>
@@ -1733,6 +1789,7 @@
         <w:ind w:firstLine="720"/>
         <w:jc w:val="both"/>
         <w:rPr>
+          <w:rFonts w:asciiTheme="minorBidi" w:hAnsiTheme="minorBidi"/>
           <w:b/>
           <w:bCs/>
           <w:sz w:val="32"/>
@@ -1742,7 +1799,7 @@
       </w:pPr>
       <w:r>
         <w:rPr>
-          <w:rFonts w:cs="Mangal"/>
+          <w:rFonts w:asciiTheme="minorBidi" w:hAnsiTheme="minorBidi"/>
           <w:sz w:val="28"/>
           <w:szCs w:val="28"/>
           <w:cs/>
@@ -1752,6 +1809,7 @@
       </w:r>
       <w:r>
         <w:rPr>
+          <w:rFonts w:asciiTheme="minorBidi" w:hAnsiTheme="minorBidi"/>
           <w:sz w:val="28"/>
           <w:szCs w:val="28"/>
         </w:rPr>
@@ -1759,7 +1817,7 @@
       </w:r>
       <w:r>
         <w:rPr>
-          <w:rFonts w:cs="Mangal"/>
+          <w:rFonts w:asciiTheme="minorBidi" w:hAnsiTheme="minorBidi"/>
           <w:sz w:val="28"/>
           <w:szCs w:val="28"/>
           <w:cs/>
@@ -1769,6 +1827,7 @@
       </w:r>
       <w:r>
         <w:rPr>
+          <w:rFonts w:asciiTheme="minorBidi" w:hAnsiTheme="minorBidi"/>
           <w:sz w:val="28"/>
           <w:szCs w:val="28"/>
         </w:rPr>
@@ -1776,7 +1835,7 @@
       </w:r>
       <w:r>
         <w:rPr>
-          <w:rFonts w:cs="Mangal"/>
+          <w:rFonts w:asciiTheme="minorBidi" w:hAnsiTheme="minorBidi"/>
           <w:sz w:val="28"/>
           <w:szCs w:val="28"/>
           <w:cs/>
@@ -1786,6 +1845,7 @@
       </w:r>
       <w:r>
         <w:rPr>
+          <w:rFonts w:asciiTheme="minorBidi" w:hAnsiTheme="minorBidi"/>
           <w:sz w:val="28"/>
           <w:szCs w:val="28"/>
         </w:rPr>
@@ -1793,7 +1853,7 @@
       </w:r>
       <w:r>
         <w:rPr>
-          <w:rFonts w:cs="Mangal"/>
+          <w:rFonts w:asciiTheme="minorBidi" w:hAnsiTheme="minorBidi"/>
           <w:sz w:val="28"/>
           <w:szCs w:val="28"/>
           <w:cs/>
@@ -1806,6 +1866,7 @@
       <w:pPr>
         <w:spacing w:after="0"/>
         <w:rPr>
+          <w:rFonts w:asciiTheme="minorBidi" w:hAnsiTheme="minorBidi"/>
           <w:sz w:val="28"/>
           <w:szCs w:val="28"/>
         </w:rPr>
@@ -1816,13 +1877,14 @@
         <w:spacing w:after="0"/>
         <w:ind w:left="6480" w:firstLine="720"/>
         <w:rPr>
-          <w:sz w:val="28"/>
-          <w:szCs w:val="28"/>
-        </w:rPr>
-      </w:pPr>
-      <w:r>
-        <w:rPr>
-          <w:rFonts w:cs="Mangal"/>
+          <w:rFonts w:asciiTheme="minorBidi" w:hAnsiTheme="minorBidi"/>
+          <w:sz w:val="28"/>
+          <w:szCs w:val="28"/>
+        </w:rPr>
+      </w:pPr>
+      <w:r>
+        <w:rPr>
+          <w:rFonts w:asciiTheme="minorBidi" w:hAnsiTheme="minorBidi"/>
           <w:sz w:val="28"/>
           <w:szCs w:val="28"/>
           <w:cs/>
@@ -1836,12 +1898,14 @@
         <w:spacing w:after="0"/>
         <w:ind w:left="5760"/>
         <w:rPr>
-          <w:sz w:val="28"/>
-          <w:szCs w:val="28"/>
-        </w:rPr>
-      </w:pPr>
-      <w:r>
-        <w:rPr>
+          <w:rFonts w:asciiTheme="minorBidi" w:hAnsiTheme="minorBidi"/>
+          <w:sz w:val="28"/>
+          <w:szCs w:val="28"/>
+        </w:rPr>
+      </w:pPr>
+      <w:r>
+        <w:rPr>
+          <w:rFonts w:asciiTheme="minorBidi" w:hAnsiTheme="minorBidi"/>
           <w:sz w:val="28"/>
           <w:szCs w:val="28"/>
         </w:rPr>
@@ -1853,6 +1917,7 @@
         <w:spacing w:after="0"/>
         <w:ind w:left="5760"/>
         <w:rPr>
+          <w:rFonts w:asciiTheme="minorBidi" w:hAnsiTheme="minorBidi"/>
           <w:sz w:val="28"/>
           <w:szCs w:val="28"/>
         </w:rPr>
@@ -1863,12 +1928,14 @@
         <w:spacing w:after="0"/>
         <w:ind w:left="5760"/>
         <w:rPr>
-          <w:sz w:val="28"/>
-          <w:szCs w:val="28"/>
-        </w:rPr>
-      </w:pPr>
-      <w:r>
-        <w:rPr>
+          <w:rFonts w:asciiTheme="minorBidi" w:hAnsiTheme="minorBidi"/>
+          <w:sz w:val="28"/>
+          <w:szCs w:val="28"/>
+        </w:rPr>
+      </w:pPr>
+      <w:r>
+        <w:rPr>
+          <w:rFonts w:asciiTheme="minorBidi" w:hAnsiTheme="minorBidi"/>
           <w:sz w:val="28"/>
           <w:szCs w:val="28"/>
         </w:rPr>
@@ -1879,13 +1946,14 @@
       <w:pPr>
         <w:spacing w:after="0"/>
         <w:rPr>
-          <w:sz w:val="28"/>
-          <w:szCs w:val="28"/>
-        </w:rPr>
-      </w:pPr>
-      <w:r>
-        <w:rPr>
-          <w:rFonts w:cs="Mangal"/>
+          <w:rFonts w:asciiTheme="minorBidi" w:hAnsiTheme="minorBidi"/>
+          <w:sz w:val="28"/>
+          <w:szCs w:val="28"/>
+        </w:rPr>
+      </w:pPr>
+      <w:r>
+        <w:rPr>
+          <w:rFonts w:asciiTheme="minorBidi" w:hAnsiTheme="minorBidi"/>
           <w:sz w:val="28"/>
           <w:szCs w:val="28"/>
           <w:cs/>

</xml_diff>